<commit_message>
Add final project pdf
</commit_message>
<xml_diff>
--- a/PROJECT DOCUMENTATION Final.docx
+++ b/PROJECT DOCUMENTATION Final.docx
@@ -528,7 +528,7 @@
           <w:noProof/>
         </w:rPr>
         <w:drawing>
-          <wp:inline distT="0" distB="0" distL="0" distR="0" wp14:anchorId="5718602F" wp14:editId="0B669DDD">
+          <wp:inline distT="0" distB="0" distL="0" distR="0" wp14:anchorId="5718602F" wp14:editId="6DEE0879">
             <wp:extent cx="5731368" cy="1146020"/>
             <wp:effectExtent l="0" t="0" r="3175" b="0"/>
             <wp:docPr id="1129786526" name="Picture 19"/>
@@ -821,19 +821,7 @@
         <w:rPr>
           <w:lang w:val="en-ZA"/>
         </w:rPr>
-        <w:t xml:space="preserve">I declare that this </w:t>
-      </w:r>
-      <w:r>
-        <w:rPr>
-          <w:lang w:val="en-ZA"/>
-        </w:rPr>
-        <w:t>assignment</w:t>
-      </w:r>
-      <w:r>
-        <w:rPr>
-          <w:lang w:val="en-ZA"/>
-        </w:rPr>
-        <w:t xml:space="preserve"> is my own original work. Where other people’s work has been used (either from a printed source, internet or any other source), this has been properly acknowledged and referenced in accordance with the requirements as stated in the University's plagiarism prevention policy.</w:t>
+        <w:t>I declare that this assignment is my own original work. Where other people’s work has been used (either from a printed source, internet or any other source), this has been properly acknowledged and referenced in accordance with the requirements as stated in the University's plagiarism prevention policy.</w:t>
       </w:r>
     </w:p>
     <w:p>
@@ -1191,7 +1179,7 @@
                 <w:noProof/>
               </w:rPr>
               <w:drawing>
-                <wp:anchor distT="0" distB="0" distL="114300" distR="114300" simplePos="0" relativeHeight="251660288" behindDoc="0" locked="0" layoutInCell="1" allowOverlap="1" wp14:anchorId="745B66A3" wp14:editId="1B581B22">
+                <wp:anchor distT="0" distB="0" distL="114300" distR="114300" simplePos="0" relativeHeight="251660288" behindDoc="0" locked="0" layoutInCell="1" allowOverlap="1" wp14:anchorId="745B66A3" wp14:editId="7EED3A99">
                   <wp:simplePos x="0" y="0"/>
                   <wp:positionH relativeFrom="column">
                     <wp:posOffset>485517</wp:posOffset>
@@ -1316,7 +1304,7 @@
                 <w:noProof/>
               </w:rPr>
               <w:drawing>
-                <wp:anchor distT="0" distB="0" distL="114300" distR="114300" simplePos="0" relativeHeight="251663360" behindDoc="1" locked="0" layoutInCell="1" allowOverlap="1" wp14:anchorId="67C58BE6" wp14:editId="6F6BF30D">
+                <wp:anchor distT="0" distB="0" distL="114300" distR="114300" simplePos="0" relativeHeight="251663360" behindDoc="1" locked="0" layoutInCell="1" allowOverlap="1" wp14:anchorId="67C58BE6" wp14:editId="7584B3A8">
                   <wp:simplePos x="0" y="0"/>
                   <wp:positionH relativeFrom="column">
                     <wp:posOffset>252577</wp:posOffset>
@@ -1660,7 +1648,7 @@
                 <w:noProof/>
               </w:rPr>
               <w:drawing>
-                <wp:anchor distT="0" distB="0" distL="114300" distR="114300" simplePos="0" relativeHeight="251662336" behindDoc="0" locked="0" layoutInCell="1" allowOverlap="1" wp14:anchorId="384E2DD3" wp14:editId="2CF89406">
+                <wp:anchor distT="0" distB="0" distL="114300" distR="114300" simplePos="0" relativeHeight="251662336" behindDoc="0" locked="0" layoutInCell="1" allowOverlap="1" wp14:anchorId="384E2DD3" wp14:editId="39185514">
                   <wp:simplePos x="0" y="0"/>
                   <wp:positionH relativeFrom="column">
                     <wp:posOffset>306673</wp:posOffset>
@@ -1790,7 +1778,7 @@
           <w:r>
             <w:fldChar w:fldCharType="separate"/>
           </w:r>
-          <w:hyperlink w:anchor="_Toc211249929" w:history="1">
+          <w:hyperlink w:anchor="_Toc211265424" w:history="1">
             <w:r>
               <w:rPr>
                 <w:rStyle w:val="Hyperlink"/>
@@ -1812,7 +1800,7 @@
                 <w:rFonts w:eastAsia="Arial"/>
                 <w:noProof/>
               </w:rPr>
-              <w:t>Business Background</w:t>
+              <w:t>BUSINESS BACKGROUND</w:t>
             </w:r>
             <w:r>
               <w:rPr>
@@ -1833,7 +1821,7 @@
                 <w:noProof/>
                 <w:webHidden/>
               </w:rPr>
-              <w:instrText xml:space="preserve"> PAGEREF _Toc211249929 \h </w:instrText>
+              <w:instrText xml:space="preserve"> PAGEREF _Toc211265424 \h </w:instrText>
             </w:r>
             <w:r>
               <w:rPr>
@@ -1876,7 +1864,7 @@
               <w:noProof/>
             </w:rPr>
           </w:pPr>
-          <w:hyperlink w:anchor="_Toc211249930" w:history="1">
+          <w:hyperlink w:anchor="_Toc211265425" w:history="1">
             <w:r>
               <w:rPr>
                 <w:rStyle w:val="Hyperlink"/>
@@ -1898,7 +1886,23 @@
                 <w:rFonts w:eastAsia="Arial"/>
                 <w:noProof/>
               </w:rPr>
-              <w:t>Problem Statement</w:t>
+              <w:t>PR</w:t>
+            </w:r>
+            <w:r>
+              <w:rPr>
+                <w:rStyle w:val="Hyperlink"/>
+                <w:rFonts w:eastAsia="Arial"/>
+                <w:noProof/>
+              </w:rPr>
+              <w:t>O</w:t>
+            </w:r>
+            <w:r>
+              <w:rPr>
+                <w:rStyle w:val="Hyperlink"/>
+                <w:rFonts w:eastAsia="Arial"/>
+                <w:noProof/>
+              </w:rPr>
+              <w:t>BLEM STATEMENT</w:t>
             </w:r>
             <w:r>
               <w:rPr>
@@ -1919,7 +1923,7 @@
                 <w:noProof/>
                 <w:webHidden/>
               </w:rPr>
-              <w:instrText xml:space="preserve"> PAGEREF _Toc211249930 \h </w:instrText>
+              <w:instrText xml:space="preserve"> PAGEREF _Toc211265425 \h </w:instrText>
             </w:r>
             <w:r>
               <w:rPr>
@@ -1962,7 +1966,7 @@
               <w:noProof/>
             </w:rPr>
           </w:pPr>
-          <w:hyperlink w:anchor="_Toc211249931" w:history="1">
+          <w:hyperlink w:anchor="_Toc211265426" w:history="1">
             <w:r>
               <w:rPr>
                 <w:rStyle w:val="Hyperlink"/>
@@ -1984,7 +1988,7 @@
                 <w:rFonts w:eastAsia="Arial"/>
                 <w:noProof/>
               </w:rPr>
-              <w:t>Solution</w:t>
+              <w:t>SOLUTION</w:t>
             </w:r>
             <w:r>
               <w:rPr>
@@ -2005,7 +2009,7 @@
                 <w:noProof/>
                 <w:webHidden/>
               </w:rPr>
-              <w:instrText xml:space="preserve"> PAGEREF _Toc211249931 \h </w:instrText>
+              <w:instrText xml:space="preserve"> PAGEREF _Toc211265426 \h </w:instrText>
             </w:r>
             <w:r>
               <w:rPr>
@@ -2048,7 +2052,7 @@
               <w:noProof/>
             </w:rPr>
           </w:pPr>
-          <w:hyperlink w:anchor="_Toc211249932" w:history="1">
+          <w:hyperlink w:anchor="_Toc211265427" w:history="1">
             <w:r>
               <w:rPr>
                 <w:rStyle w:val="Hyperlink"/>
@@ -2070,7 +2074,7 @@
                 <w:rFonts w:eastAsia="Arial"/>
                 <w:noProof/>
               </w:rPr>
-              <w:t>How will it benefit the community?</w:t>
+              <w:t>HOW WILL IT BENEFIT THE COMMUNITY?</w:t>
             </w:r>
             <w:r>
               <w:rPr>
@@ -2091,7 +2095,7 @@
                 <w:noProof/>
                 <w:webHidden/>
               </w:rPr>
-              <w:instrText xml:space="preserve"> PAGEREF _Toc211249932 \h </w:instrText>
+              <w:instrText xml:space="preserve"> PAGEREF _Toc211265427 \h </w:instrText>
             </w:r>
             <w:r>
               <w:rPr>
@@ -2134,7 +2138,7 @@
               <w:noProof/>
             </w:rPr>
           </w:pPr>
-          <w:hyperlink w:anchor="_Toc211249933" w:history="1">
+          <w:hyperlink w:anchor="_Toc211265428" w:history="1">
             <w:r>
               <w:rPr>
                 <w:rStyle w:val="Hyperlink"/>
@@ -2177,7 +2181,7 @@
                 <w:noProof/>
                 <w:webHidden/>
               </w:rPr>
-              <w:instrText xml:space="preserve"> PAGEREF _Toc211249933 \h </w:instrText>
+              <w:instrText xml:space="preserve"> PAGEREF _Toc211265428 \h </w:instrText>
             </w:r>
             <w:r>
               <w:rPr>
@@ -2220,7 +2224,7 @@
               <w:noProof/>
             </w:rPr>
           </w:pPr>
-          <w:hyperlink w:anchor="_Toc211249934" w:history="1">
+          <w:hyperlink w:anchor="_Toc211265429" w:history="1">
             <w:r>
               <w:rPr>
                 <w:rStyle w:val="Hyperlink"/>
@@ -2261,7 +2265,7 @@
                 <w:noProof/>
                 <w:webHidden/>
               </w:rPr>
-              <w:instrText xml:space="preserve"> PAGEREF _Toc211249934 \h </w:instrText>
+              <w:instrText xml:space="preserve"> PAGEREF _Toc211265429 \h </w:instrText>
             </w:r>
             <w:r>
               <w:rPr>
@@ -2304,7 +2308,7 @@
               <w:noProof/>
             </w:rPr>
           </w:pPr>
-          <w:hyperlink w:anchor="_Toc211249935" w:history="1">
+          <w:hyperlink w:anchor="_Toc211265430" w:history="1">
             <w:r>
               <w:rPr>
                 <w:rStyle w:val="Hyperlink"/>
@@ -2347,7 +2351,7 @@
                 <w:noProof/>
                 <w:webHidden/>
               </w:rPr>
-              <w:instrText xml:space="preserve"> PAGEREF _Toc211249935 \h </w:instrText>
+              <w:instrText xml:space="preserve"> PAGEREF _Toc211265430 \h </w:instrText>
             </w:r>
             <w:r>
               <w:rPr>
@@ -2390,7 +2394,7 @@
               <w:noProof/>
             </w:rPr>
           </w:pPr>
-          <w:hyperlink w:anchor="_Toc211249936" w:history="1">
+          <w:hyperlink w:anchor="_Toc211265431" w:history="1">
             <w:r>
               <w:rPr>
                 <w:rStyle w:val="Hyperlink"/>
@@ -2433,7 +2437,7 @@
                 <w:noProof/>
                 <w:webHidden/>
               </w:rPr>
-              <w:instrText xml:space="preserve"> PAGEREF _Toc211249936 \h </w:instrText>
+              <w:instrText xml:space="preserve"> PAGEREF _Toc211265431 \h </w:instrText>
             </w:r>
             <w:r>
               <w:rPr>
@@ -2476,7 +2480,7 @@
               <w:noProof/>
             </w:rPr>
           </w:pPr>
-          <w:hyperlink w:anchor="_Toc211249937" w:history="1">
+          <w:hyperlink w:anchor="_Toc211265432" w:history="1">
             <w:r>
               <w:rPr>
                 <w:rStyle w:val="Hyperlink"/>
@@ -2519,7 +2523,7 @@
                 <w:noProof/>
                 <w:webHidden/>
               </w:rPr>
-              <w:instrText xml:space="preserve"> PAGEREF _Toc211249937 \h </w:instrText>
+              <w:instrText xml:space="preserve"> PAGEREF _Toc211265432 \h </w:instrText>
             </w:r>
             <w:r>
               <w:rPr>
@@ -2562,7 +2566,7 @@
               <w:noProof/>
             </w:rPr>
           </w:pPr>
-          <w:hyperlink w:anchor="_Toc211249938" w:history="1">
+          <w:hyperlink w:anchor="_Toc211265433" w:history="1">
             <w:r>
               <w:rPr>
                 <w:rStyle w:val="Hyperlink"/>
@@ -2605,7 +2609,7 @@
                 <w:noProof/>
                 <w:webHidden/>
               </w:rPr>
-              <w:instrText xml:space="preserve"> PAGEREF _Toc211249938 \h </w:instrText>
+              <w:instrText xml:space="preserve"> PAGEREF _Toc211265433 \h </w:instrText>
             </w:r>
             <w:r>
               <w:rPr>
@@ -2648,7 +2652,7 @@
               <w:noProof/>
             </w:rPr>
           </w:pPr>
-          <w:hyperlink w:anchor="_Toc211249939" w:history="1">
+          <w:hyperlink w:anchor="_Toc211265434" w:history="1">
             <w:r>
               <w:rPr>
                 <w:rStyle w:val="Hyperlink"/>
@@ -2691,7 +2695,7 @@
                 <w:noProof/>
                 <w:webHidden/>
               </w:rPr>
-              <w:instrText xml:space="preserve"> PAGEREF _Toc211249939 \h </w:instrText>
+              <w:instrText xml:space="preserve"> PAGEREF _Toc211265434 \h </w:instrText>
             </w:r>
             <w:r>
               <w:rPr>
@@ -2734,7 +2738,7 @@
               <w:noProof/>
             </w:rPr>
           </w:pPr>
-          <w:hyperlink w:anchor="_Toc211249940" w:history="1">
+          <w:hyperlink w:anchor="_Toc211265435" w:history="1">
             <w:r>
               <w:rPr>
                 <w:rStyle w:val="Hyperlink"/>
@@ -2777,7 +2781,7 @@
                 <w:noProof/>
                 <w:webHidden/>
               </w:rPr>
-              <w:instrText xml:space="preserve"> PAGEREF _Toc211249940 \h </w:instrText>
+              <w:instrText xml:space="preserve"> PAGEREF _Toc211265435 \h </w:instrText>
             </w:r>
             <w:r>
               <w:rPr>
@@ -2820,7 +2824,7 @@
               <w:noProof/>
             </w:rPr>
           </w:pPr>
-          <w:hyperlink w:anchor="_Toc211249941" w:history="1">
+          <w:hyperlink w:anchor="_Toc211265436" w:history="1">
             <w:r>
               <w:rPr>
                 <w:rStyle w:val="Hyperlink"/>
@@ -2863,7 +2867,7 @@
                 <w:noProof/>
                 <w:webHidden/>
               </w:rPr>
-              <w:instrText xml:space="preserve"> PAGEREF _Toc211249941 \h </w:instrText>
+              <w:instrText xml:space="preserve"> PAGEREF _Toc211265436 \h </w:instrText>
             </w:r>
             <w:r>
               <w:rPr>
@@ -2906,7 +2910,7 @@
               <w:noProof/>
             </w:rPr>
           </w:pPr>
-          <w:hyperlink w:anchor="_Toc211249942" w:history="1">
+          <w:hyperlink w:anchor="_Toc211265437" w:history="1">
             <w:r>
               <w:rPr>
                 <w:rStyle w:val="Hyperlink"/>
@@ -2926,7 +2930,7 @@
                 <w:rStyle w:val="Hyperlink"/>
                 <w:noProof/>
               </w:rPr>
-              <w:t>Grammarly writing report</w:t>
+              <w:t>GRAMMARLY WRITING REPORT</w:t>
             </w:r>
             <w:r>
               <w:rPr>
@@ -2947,7 +2951,7 @@
                 <w:noProof/>
                 <w:webHidden/>
               </w:rPr>
-              <w:instrText xml:space="preserve"> PAGEREF _Toc211249942 \h </w:instrText>
+              <w:instrText xml:space="preserve"> PAGEREF _Toc211265437 \h </w:instrText>
             </w:r>
             <w:r>
               <w:rPr>
@@ -2967,7 +2971,91 @@
                 <w:noProof/>
                 <w:webHidden/>
               </w:rPr>
-              <w:t>7</w:t>
+              <w:t>8</w:t>
+            </w:r>
+            <w:r>
+              <w:rPr>
+                <w:noProof/>
+                <w:webHidden/>
+              </w:rPr>
+              <w:fldChar w:fldCharType="end"/>
+            </w:r>
+          </w:hyperlink>
+        </w:p>
+        <w:p>
+          <w:pPr>
+            <w:pStyle w:val="TOC1"/>
+            <w:tabs>
+              <w:tab w:val="left" w:pos="480"/>
+              <w:tab w:val="right" w:leader="dot" w:pos="9017"/>
+            </w:tabs>
+            <w:rPr>
+              <w:rFonts w:asciiTheme="minorHAnsi" w:eastAsiaTheme="minorEastAsia" w:hAnsiTheme="minorHAnsi"/>
+              <w:noProof/>
+            </w:rPr>
+          </w:pPr>
+          <w:hyperlink w:anchor="_Toc211265438" w:history="1">
+            <w:r>
+              <w:rPr>
+                <w:rStyle w:val="Hyperlink"/>
+                <w:noProof/>
+              </w:rPr>
+              <w:t>7.</w:t>
+            </w:r>
+            <w:r>
+              <w:rPr>
+                <w:rFonts w:asciiTheme="minorHAnsi" w:eastAsiaTheme="minorEastAsia" w:hAnsiTheme="minorHAnsi"/>
+                <w:noProof/>
+              </w:rPr>
+              <w:tab/>
+            </w:r>
+            <w:r>
+              <w:rPr>
+                <w:rStyle w:val="Hyperlink"/>
+                <w:noProof/>
+              </w:rPr>
+              <w:t>REFERENCE LIST</w:t>
+            </w:r>
+            <w:r>
+              <w:rPr>
+                <w:noProof/>
+                <w:webHidden/>
+              </w:rPr>
+              <w:tab/>
+            </w:r>
+            <w:r>
+              <w:rPr>
+                <w:noProof/>
+                <w:webHidden/>
+              </w:rPr>
+              <w:fldChar w:fldCharType="begin"/>
+            </w:r>
+            <w:r>
+              <w:rPr>
+                <w:noProof/>
+                <w:webHidden/>
+              </w:rPr>
+              <w:instrText xml:space="preserve"> PAGEREF _Toc211265438 \h </w:instrText>
+            </w:r>
+            <w:r>
+              <w:rPr>
+                <w:noProof/>
+                <w:webHidden/>
+              </w:rPr>
+            </w:r>
+            <w:r>
+              <w:rPr>
+                <w:noProof/>
+                <w:webHidden/>
+              </w:rPr>
+              <w:fldChar w:fldCharType="separate"/>
+            </w:r>
+            <w:r>
+              <w:rPr>
+                <w:noProof/>
+                <w:webHidden/>
+              </w:rPr>
+              <w:t>9</w:t>
             </w:r>
             <w:r>
               <w:rPr>
@@ -3017,7 +3105,7 @@
           <w:szCs w:val="24"/>
         </w:rPr>
       </w:pPr>
-      <w:bookmarkStart w:id="0" w:name="_Toc211249929"/>
+      <w:bookmarkStart w:id="0" w:name="_Toc211265424"/>
       <w:r>
         <w:rPr>
           <w:rFonts w:eastAsia="Arial"/>
@@ -3062,7 +3150,7 @@
           <w:szCs w:val="24"/>
         </w:rPr>
       </w:pPr>
-      <w:bookmarkStart w:id="1" w:name="_Toc211249930"/>
+      <w:bookmarkStart w:id="1" w:name="_Toc211265425"/>
       <w:r>
         <w:rPr>
           <w:rFonts w:eastAsia="Arial"/>
@@ -3142,7 +3230,7 @@
           <w:szCs w:val="24"/>
         </w:rPr>
       </w:pPr>
-      <w:bookmarkStart w:id="2" w:name="_Toc211249931"/>
+      <w:bookmarkStart w:id="2" w:name="_Toc211265426"/>
       <w:r>
         <w:rPr>
           <w:rFonts w:eastAsia="Arial"/>
@@ -3198,7 +3286,7 @@
           <w:szCs w:val="24"/>
         </w:rPr>
       </w:pPr>
-      <w:bookmarkStart w:id="3" w:name="_Toc211249932"/>
+      <w:bookmarkStart w:id="3" w:name="_Toc211265427"/>
       <w:r>
         <w:rPr>
           <w:rFonts w:eastAsia="Arial"/>
@@ -3242,7 +3330,7 @@
           <w:szCs w:val="24"/>
         </w:rPr>
       </w:pPr>
-      <w:bookmarkStart w:id="4" w:name="_Toc211249933"/>
+      <w:bookmarkStart w:id="4" w:name="_Toc211265428"/>
       <w:r>
         <w:rPr>
           <w:rFonts w:eastAsia="Arial"/>
@@ -3265,7 +3353,7 @@
           <w:szCs w:val="24"/>
         </w:rPr>
       </w:pPr>
-      <w:bookmarkStart w:id="5" w:name="_Toc211249934"/>
+      <w:bookmarkStart w:id="5" w:name="_Toc211265429"/>
       <w:r>
         <w:rPr>
           <w:szCs w:val="24"/>
@@ -3413,7 +3501,7 @@
           <w:rFonts w:eastAsia="Arial"/>
         </w:rPr>
       </w:pPr>
-      <w:bookmarkStart w:id="6" w:name="_Toc211249935"/>
+      <w:bookmarkStart w:id="6" w:name="_Toc211265430"/>
       <w:r>
         <w:rPr>
           <w:rFonts w:eastAsia="Arial"/>
@@ -3504,7 +3592,7 @@
           <w:szCs w:val="24"/>
         </w:rPr>
       </w:pPr>
-      <w:bookmarkStart w:id="7" w:name="_Toc211249936"/>
+      <w:bookmarkStart w:id="7" w:name="_Toc211265431"/>
       <w:r>
         <w:rPr>
           <w:rFonts w:eastAsia="Arial"/>
@@ -3661,7 +3749,7 @@
           <w:szCs w:val="24"/>
         </w:rPr>
       </w:pPr>
-      <w:bookmarkStart w:id="8" w:name="_Toc211249937"/>
+      <w:bookmarkStart w:id="8" w:name="_Toc211265432"/>
       <w:r>
         <w:rPr>
           <w:rFonts w:eastAsia="Arial"/>
@@ -3769,7 +3857,7 @@
           <w:szCs w:val="24"/>
         </w:rPr>
       </w:pPr>
-      <w:bookmarkStart w:id="9" w:name="_Toc211249938"/>
+      <w:bookmarkStart w:id="9" w:name="_Toc211265433"/>
       <w:r>
         <w:rPr>
           <w:rFonts w:eastAsia="Arial"/>
@@ -3861,7 +3949,7 @@
           <w:szCs w:val="24"/>
         </w:rPr>
       </w:pPr>
-      <w:bookmarkStart w:id="10" w:name="_Toc211249939"/>
+      <w:bookmarkStart w:id="10" w:name="_Toc211265434"/>
       <w:r>
         <w:rPr>
           <w:rFonts w:eastAsia="Arial"/>
@@ -4234,7 +4322,7 @@
           <w:szCs w:val="24"/>
         </w:rPr>
       </w:pPr>
-      <w:bookmarkStart w:id="11" w:name="_Toc211249940"/>
+      <w:bookmarkStart w:id="11" w:name="_Toc211265435"/>
       <w:r>
         <w:rPr>
           <w:rFonts w:eastAsia="Arial"/>
@@ -4478,7 +4566,7 @@
           <w:szCs w:val="24"/>
         </w:rPr>
       </w:pPr>
-      <w:bookmarkStart w:id="12" w:name="_Toc211249941"/>
+      <w:bookmarkStart w:id="12" w:name="_Toc211265436"/>
       <w:r>
         <w:rPr>
           <w:rFonts w:eastAsia="Arial"/>
@@ -4573,45 +4661,15 @@
       </w:r>
     </w:p>
     <w:p>
-      <w:pPr>
-        <w:rPr>
-          <w:rFonts w:cs="Arial"/>
-        </w:rPr>
-      </w:pPr>
-    </w:p>
-    <w:p>
-      <w:pPr>
-        <w:rPr>
-          <w:rFonts w:cs="Arial"/>
-        </w:rPr>
-      </w:pPr>
-    </w:p>
-    <w:p>
-      <w:pPr>
-        <w:rPr>
-          <w:rFonts w:cs="Arial"/>
-        </w:rPr>
-      </w:pPr>
-    </w:p>
-    <w:p>
-      <w:pPr>
-        <w:rPr>
-          <w:rFonts w:cs="Arial"/>
-        </w:rPr>
-      </w:pPr>
-    </w:p>
-    <w:p>
-      <w:pPr>
-        <w:rPr>
-          <w:rFonts w:cs="Arial"/>
-        </w:rPr>
-      </w:pPr>
+      <w:r>
+        <w:br w:type="page"/>
+      </w:r>
     </w:p>
     <w:p>
       <w:pPr>
         <w:pStyle w:val="Heading1"/>
       </w:pPr>
-      <w:bookmarkStart w:id="13" w:name="_Toc211249942"/>
+      <w:bookmarkStart w:id="13" w:name="_Toc211265437"/>
       <w:r>
         <w:lastRenderedPageBreak/>
         <w:t>Gramm</w:t>
@@ -6486,6 +6544,77 @@
         </w:rPr>
       </w:pPr>
     </w:p>
+    <w:p>
+      <w:pPr>
+        <w:rPr>
+          <w:rFonts w:cs="Arial"/>
+        </w:rPr>
+      </w:pPr>
+      <w:r>
+        <w:rPr>
+          <w:rFonts w:cs="Arial"/>
+        </w:rPr>
+        <w:br w:type="page"/>
+      </w:r>
+    </w:p>
+    <w:p>
+      <w:pPr>
+        <w:pStyle w:val="Heading1"/>
+      </w:pPr>
+      <w:bookmarkStart w:id="14" w:name="_Toc211265438"/>
+      <w:r>
+        <w:lastRenderedPageBreak/>
+        <w:t>REFERENC</w:t>
+      </w:r>
+      <w:r>
+        <w:t>E LIST</w:t>
+      </w:r>
+      <w:bookmarkEnd w:id="14"/>
+    </w:p>
+    <w:p>
+      <w:pPr>
+        <w:spacing w:line="360" w:lineRule="auto"/>
+        <w:ind w:left="567"/>
+        <w:jc w:val="both"/>
+      </w:pPr>
+      <w:proofErr w:type="spellStart"/>
+      <w:proofErr w:type="gramStart"/>
+      <w:r>
+        <w:t>Bao,Q</w:t>
+      </w:r>
+      <w:proofErr w:type="spellEnd"/>
+      <w:r>
+        <w:t>.</w:t>
+      </w:r>
+      <w:proofErr w:type="gramEnd"/>
+      <w:r>
+        <w:t>(2024). Enhancing Salary Prediction Accuracy with Advanced Machine Learning Models. Xinjiang University: New York University.</w:t>
+      </w:r>
+    </w:p>
+    <w:p>
+      <w:pPr>
+        <w:spacing w:line="360" w:lineRule="auto"/>
+        <w:ind w:left="567"/>
+        <w:jc w:val="both"/>
+      </w:pPr>
+      <w:proofErr w:type="spellStart"/>
+      <w:proofErr w:type="gramStart"/>
+      <w:r>
+        <w:t>Rattanaporn,K</w:t>
+      </w:r>
+      <w:proofErr w:type="spellEnd"/>
+      <w:proofErr w:type="gramEnd"/>
+      <w:r>
+        <w:t>(2022). Salary Prediction dataset.</w:t>
+      </w:r>
+    </w:p>
+    <w:p>
+      <w:pPr>
+        <w:rPr>
+          <w:rFonts w:cs="Arial"/>
+        </w:rPr>
+      </w:pPr>
+    </w:p>
     <w:sectPr>
       <w:pgSz w:w="12240" w:h="15840"/>
       <w:pgMar w:top="1440" w:right="1440" w:bottom="1440" w:left="1440" w:header="708" w:footer="708" w:gutter="0"/>
@@ -9217,7 +9346,7 @@
   <w:abstractNum w:abstractNumId="21" w15:restartNumberingAfterBreak="0">
     <w:nsid w:val="67E22940"/>
     <w:multiLevelType w:val="hybridMultilevel"/>
-    <w:tmpl w:val="865CF138"/>
+    <w:tmpl w:val="2852383E"/>
     <w:lvl w:ilvl="0" w:tplc="04090001">
       <w:start w:val="1"/>
       <w:numFmt w:val="bullet"/>
@@ -9505,7 +9634,6 @@
   </w:num>
   <w:num w:numId="13" w16cid:durableId="770931606">
     <w:abstractNumId w:val="18"/>
-    <w:lvlOverride w:ilvl="0"/>
   </w:num>
   <w:num w:numId="14" w16cid:durableId="370148974">
     <w:abstractNumId w:val="2"/>
@@ -9551,8 +9679,6 @@
   </w:num>
   <w:num w:numId="27" w16cid:durableId="179201300">
     <w:abstractNumId w:val="18"/>
-    <w:lvlOverride w:ilvl="0"/>
-    <w:lvlOverride w:ilvl="1"/>
   </w:num>
 </w:numbering>
 </file>
@@ -10167,6 +10293,7 @@
   <w:style w:type="character" w:default="1" w:styleId="DefaultParagraphFont">
     <w:name w:val="Default Paragraph Font"/>
     <w:uiPriority w:val="1"/>
+    <w:semiHidden/>
     <w:unhideWhenUsed/>
   </w:style>
   <w:style w:type="table" w:default="1" w:styleId="TableNormal">

</xml_diff>